<commit_message>
add delay before starting service in run-distributed.ps1 for improved stability
</commit_message>
<xml_diff>
--- a/docs/Design_Document_EOS_Idempotent_Payments.docx
+++ b/docs/Design_Document_EOS_Idempotent_Payments.docx
@@ -368,69 +368,28 @@
         <w:rPr>
           <w:rFonts w:ascii="Courier New" w:hAnsi="Courier New"/>
         </w:rPr>
-        <w:t xml:space="preserve">     </w:t>
-      </w:r>
-      <w:r>
-        <w:rPr>
-          <w:rFonts w:ascii="Courier New" w:hAnsi="Courier New"/>
-        </w:rPr>
-        <w:t>React Dashboard / API Client</w:t>
+        <w:t xml:space="preserve">     React Dashboard / API Client</w:t>
       </w:r>
       <w:r>
         <w:rPr>
           <w:rFonts w:ascii="Courier New" w:hAnsi="Courier New"/>
         </w:rPr>
         <w:br/>
-        <w:t xml:space="preserve">          </w:t>
-      </w:r>
-      <w:r>
-        <w:rPr>
-          <w:rFonts w:ascii="Courier New" w:hAnsi="Courier New"/>
-        </w:rPr>
-        <w:t xml:space="preserve">          </w:t>
-      </w:r>
-      <w:r>
-        <w:rPr>
-          <w:rFonts w:ascii="Courier New" w:hAnsi="Courier New"/>
-        </w:rPr>
-        <w:t>|</w:t>
+        <w:t xml:space="preserve">                    |</w:t>
       </w:r>
       <w:r>
         <w:rPr>
           <w:rFonts w:ascii="Courier New" w:hAnsi="Courier New"/>
         </w:rPr>
         <w:br/>
-        <w:t xml:space="preserve">        </w:t>
-      </w:r>
-      <w:r>
-        <w:rPr>
-          <w:rFonts w:ascii="Courier New" w:hAnsi="Courier New"/>
-        </w:rPr>
-        <w:t xml:space="preserve">          </w:t>
-      </w:r>
-      <w:r>
-        <w:rPr>
-          <w:rFonts w:ascii="Courier New" w:hAnsi="Courier New"/>
-        </w:rPr>
-        <w:t xml:space="preserve">  v</w:t>
+        <w:t xml:space="preserve">                    v</w:t>
       </w:r>
       <w:r>
         <w:rPr>
           <w:rFonts w:ascii="Courier New" w:hAnsi="Courier New"/>
         </w:rPr>
         <w:br/>
-      </w:r>
-      <w:r>
-        <w:rPr>
-          <w:rFonts w:ascii="Courier New" w:hAnsi="Courier New"/>
-        </w:rPr>
-        <w:t xml:space="preserve">            </w:t>
-      </w:r>
-      <w:r>
-        <w:rPr>
-          <w:rFonts w:ascii="Courier New" w:hAnsi="Courier New"/>
-        </w:rPr>
-        <w:t>Gateway API :8080</w:t>
+        <w:t xml:space="preserve">            Gateway API :8080</w:t>
       </w:r>
       <w:r>
         <w:rPr>
@@ -450,11 +409,6 @@
           <w:rFonts w:ascii="Courier New" w:hAnsi="Courier New"/>
         </w:rPr>
         <w:tab/>
-      </w:r>
-      <w:r>
-        <w:rPr>
-          <w:rFonts w:ascii="Courier New" w:hAnsi="Courier New"/>
-        </w:rPr>
         <w:t>|</w:t>
       </w:r>
       <w:r>
@@ -462,178 +416,63 @@
           <w:rFonts w:ascii="Courier New" w:hAnsi="Courier New"/>
         </w:rPr>
         <w:br/>
-      </w:r>
-      <w:r>
-        <w:rPr>
-          <w:rFonts w:ascii="Courier New" w:hAnsi="Courier New"/>
-        </w:rPr>
-        <w:t xml:space="preserve">  </w:t>
-      </w:r>
-      <w:r>
-        <w:rPr>
-          <w:rFonts w:ascii="Courier New" w:hAnsi="Courier New"/>
-        </w:rPr>
-        <w:t xml:space="preserve">   +------</w:t>
-      </w:r>
-      <w:r>
-        <w:rPr>
-          <w:rFonts w:ascii="Courier New" w:hAnsi="Courier New"/>
-        </w:rPr>
-        <w:t>-</w:t>
-      </w:r>
-      <w:r>
-        <w:rPr>
-          <w:rFonts w:ascii="Courier New" w:hAnsi="Courier New"/>
-        </w:rPr>
-        <w:t>-------+----------------+</w:t>
+        <w:t xml:space="preserve">     +--------------+----------------+</w:t>
       </w:r>
       <w:r>
         <w:rPr>
           <w:rFonts w:ascii="Courier New" w:hAnsi="Courier New"/>
         </w:rPr>
         <w:br/>
-      </w:r>
-      <w:r>
-        <w:rPr>
-          <w:rFonts w:ascii="Courier New" w:hAnsi="Courier New"/>
-        </w:rPr>
-        <w:t xml:space="preserve">  </w:t>
-      </w:r>
-      <w:r>
-        <w:rPr>
-          <w:rFonts w:ascii="Courier New" w:hAnsi="Courier New"/>
-        </w:rPr>
-        <w:t xml:space="preserve">   v              v                v</w:t>
+        <w:t xml:space="preserve">     v              v                v</w:t>
       </w:r>
       <w:r>
         <w:rPr>
           <w:rFonts w:ascii="Courier New" w:hAnsi="Courier New"/>
         </w:rPr>
         <w:br/>
-      </w:r>
-      <w:r>
-        <w:rPr>
-          <w:rFonts w:ascii="Courier New" w:hAnsi="Courier New"/>
-        </w:rPr>
-        <w:t xml:space="preserve">  </w:t>
-      </w:r>
-      <w:r>
-        <w:rPr>
-          <w:rFonts w:ascii="Courier New" w:hAnsi="Courier New"/>
-        </w:rPr>
-        <w:t>NODE_A :8081   NODE_B :8082     NODE_C :8083</w:t>
+        <w:t xml:space="preserve">  NODE_A :8081   NODE_B :8082     NODE_C :8083</w:t>
       </w:r>
       <w:r>
         <w:rPr>
           <w:rFonts w:ascii="Courier New" w:hAnsi="Courier New"/>
         </w:rPr>
         <w:br/>
-      </w:r>
-      <w:r>
-        <w:rPr>
-          <w:rFonts w:ascii="Courier New" w:hAnsi="Courier New"/>
-        </w:rPr>
-        <w:t xml:space="preserve">   </w:t>
-      </w:r>
-      <w:r>
-        <w:rPr>
-          <w:rFonts w:ascii="Courier New" w:hAnsi="Courier New"/>
-        </w:rPr>
-        <w:t>node_a H2      node_b H2        node_c H2</w:t>
+        <w:t xml:space="preserve">   node_a H2      node_b H2        node_c H2</w:t>
       </w:r>
       <w:r>
         <w:rPr>
           <w:rFonts w:ascii="Courier New" w:hAnsi="Courier New"/>
         </w:rPr>
         <w:br/>
-        <w:t xml:space="preserve"> </w:t>
-      </w:r>
-      <w:r>
-        <w:rPr>
-          <w:rFonts w:ascii="Courier New" w:hAnsi="Courier New"/>
-        </w:rPr>
-        <w:t xml:space="preserve">  </w:t>
-      </w:r>
-      <w:r>
-        <w:rPr>
-          <w:rFonts w:ascii="Courier New" w:hAnsi="Courier New"/>
-        </w:rPr>
-        <w:t xml:space="preserve">  |              |                |</w:t>
+        <w:t xml:space="preserve">     |              |                |</w:t>
       </w:r>
       <w:r>
         <w:rPr>
           <w:rFonts w:ascii="Courier New" w:hAnsi="Courier New"/>
         </w:rPr>
         <w:br/>
-        <w:t xml:space="preserve">  </w:t>
-      </w:r>
-      <w:r>
-        <w:rPr>
-          <w:rFonts w:ascii="Courier New" w:hAnsi="Courier New"/>
-        </w:rPr>
-        <w:t xml:space="preserve">  </w:t>
-      </w:r>
-      <w:r>
-        <w:rPr>
-          <w:rFonts w:ascii="Courier New" w:hAnsi="Courier New"/>
-        </w:rPr>
-        <w:t xml:space="preserve"> +--------------+----------------+</w:t>
+        <w:t xml:space="preserve">     +--------------+----------------+</w:t>
       </w:r>
       <w:r>
         <w:rPr>
           <w:rFonts w:ascii="Courier New" w:hAnsi="Courier New"/>
         </w:rPr>
         <w:br/>
-        <w:t xml:space="preserve">        </w:t>
-      </w:r>
-      <w:r>
-        <w:rPr>
-          <w:rFonts w:ascii="Courier New" w:hAnsi="Courier New"/>
-        </w:rPr>
-        <w:t xml:space="preserve">          </w:t>
-      </w:r>
-      <w:r>
-        <w:rPr>
-          <w:rFonts w:ascii="Courier New" w:hAnsi="Courier New"/>
-        </w:rPr>
-        <w:t xml:space="preserve">  |</w:t>
+        <w:t xml:space="preserve">                    |</w:t>
       </w:r>
       <w:r>
         <w:rPr>
           <w:rFonts w:ascii="Courier New" w:hAnsi="Courier New"/>
         </w:rPr>
         <w:br/>
-        <w:t xml:space="preserve">         </w:t>
-      </w:r>
-      <w:r>
-        <w:rPr>
-          <w:rFonts w:ascii="Courier New" w:hAnsi="Courier New"/>
-        </w:rPr>
-        <w:t xml:space="preserve">          </w:t>
-      </w:r>
-      <w:r>
-        <w:rPr>
-          <w:rFonts w:ascii="Courier New" w:hAnsi="Courier New"/>
-        </w:rPr>
-        <w:t xml:space="preserve"> v</w:t>
+        <w:t xml:space="preserve">                    v</w:t>
       </w:r>
       <w:r>
         <w:rPr>
           <w:rFonts w:ascii="Courier New" w:hAnsi="Courier New"/>
         </w:rPr>
         <w:br/>
-      </w:r>
-      <w:r>
-        <w:rPr>
-          <w:rFonts w:ascii="Courier New" w:hAnsi="Courier New"/>
-        </w:rPr>
-        <w:t xml:space="preserve">   </w:t>
-      </w:r>
-      <w:r>
-        <w:rPr>
-          <w:rFonts w:ascii="Courier New" w:hAnsi="Courier New"/>
-        </w:rPr>
-        <w:t>Global Dedup H2: idempotency_key -&gt; result</w:t>
+        <w:t xml:space="preserve">   Global Dedup H2: idempotency_key -&gt; result</w:t>
       </w:r>
     </w:p>
     <w:tbl>
@@ -1005,7 +844,25 @@
               <w:rPr>
                 <w:sz w:val="15"/>
               </w:rPr>
-              <w:t>owner, balance, updated time</w:t>
+              <w:t>owner</w:t>
+            </w:r>
+            <w:r>
+              <w:rPr>
+                <w:sz w:val="15"/>
+              </w:rPr>
+              <w:t>Name</w:t>
+            </w:r>
+            <w:r>
+              <w:rPr>
+                <w:sz w:val="15"/>
+              </w:rPr>
+              <w:t>, balance, updated</w:t>
+            </w:r>
+            <w:r>
+              <w:rPr>
+                <w:sz w:val="15"/>
+              </w:rPr>
+              <w:t>At</w:t>
             </w:r>
           </w:p>
         </w:tc>
@@ -1071,7 +928,25 @@
               <w:rPr>
                 <w:sz w:val="15"/>
               </w:rPr>
-              <w:t>key, sender/receiver, amount, retry, node, event time, status</w:t>
+              <w:t>idempotencyKey</w:t>
+            </w:r>
+            <w:r>
+              <w:rPr>
+                <w:sz w:val="15"/>
+              </w:rPr>
+              <w:t>, sender/receiver, amount, retry</w:t>
+            </w:r>
+            <w:r>
+              <w:rPr>
+                <w:sz w:val="15"/>
+              </w:rPr>
+              <w:t>Count</w:t>
+            </w:r>
+            <w:r>
+              <w:rPr>
+                <w:sz w:val="15"/>
+              </w:rPr>
+              <w:t>, node, event time, status</w:t>
             </w:r>
           </w:p>
         </w:tc>
@@ -1139,6 +1014,12 @@
               </w:rPr>
               <w:t>request id, key, sender/receiver, amount, node</w:t>
             </w:r>
+            <w:r>
+              <w:rPr>
+                <w:sz w:val="15"/>
+              </w:rPr>
+              <w:t>Id</w:t>
+            </w:r>
           </w:p>
         </w:tc>
         <w:tc>
@@ -1203,7 +1084,13 @@
               <w:rPr>
                 <w:sz w:val="15"/>
               </w:rPr>
-              <w:t>original request, status/data, node, event time</w:t>
+              <w:t>original request, status/data, node, event</w:t>
+            </w:r>
+            <w:r>
+              <w:rPr>
+                <w:sz w:val="15"/>
+              </w:rPr>
+              <w:t>TimeMs</w:t>
             </w:r>
           </w:p>
         </w:tc>
@@ -1269,7 +1156,31 @@
               <w:rPr>
                 <w:sz w:val="15"/>
               </w:rPr>
-              <w:t>sequence, before/after data, status</w:t>
+              <w:t>sequence</w:t>
+            </w:r>
+            <w:r>
+              <w:rPr>
+                <w:sz w:val="15"/>
+              </w:rPr>
+              <w:t>Number</w:t>
+            </w:r>
+            <w:r>
+              <w:rPr>
+                <w:sz w:val="15"/>
+              </w:rPr>
+              <w:t xml:space="preserve">, </w:t>
+            </w:r>
+            <w:r>
+              <w:rPr>
+                <w:sz w:val="15"/>
+              </w:rPr>
+              <w:t>dataBefore, dataAfter</w:t>
+            </w:r>
+            <w:r>
+              <w:rPr>
+                <w:sz w:val="15"/>
+              </w:rPr>
+              <w:t>, status</w:t>
             </w:r>
           </w:p>
         </w:tc>

</xml_diff>